<commit_message>
Update cover letter, invitation letter, and sponsorship letter templates for domestic worker visa applications
- Revised the language in the Cover Letter to clarify the employment relationship with Maids.cc.
- Adjusted the Invitation Letter to specify the domestic worker's employment under Maids.cc.
- Modified the Sponsor Letter to reflect the domestic worker's employment status with Maids.cc and their role during the trip.
</commit_message>
<xml_diff>
--- a/Documents Generation/Cover_Letter.docx
+++ b/Documents Generation/Cover_Letter.docx
@@ -1216,7 +1216,7 @@
           <w:sz w:val="20"/>
           <w:szCs w:val="20"/>
         </w:rPr>
-        <w:t>under the sponsorship of</w:t>
+        <w:t>under Maids.cc working at the house of</w:t>
       </w:r>
       <w:r>
         <w:rPr>
@@ -3093,6 +3093,11 @@
     </w:p>
     <w:sectPr>
       <w:footerReference w:type="default" r:id="rId7"/>
+      <w:headerReference w:type="default" r:id="rId10"/>
+      <w:headerReference w:type="first" r:id="rId11"/>
+      <w:footerReference w:type="first" r:id="rId12"/>
+      <w:headerReference w:type="even" r:id="rId13"/>
+      <w:footerReference w:type="even" r:id="rId14"/>
       <w:pgSz w:w="11910" w:h="16840"/>
       <w:pgMar w:top="1420" w:right="1417" w:bottom="1080" w:left="1417" w:header="0" w:footer="891" w:gutter="0"/>
       <w:pgNumType w:start="1"/>
@@ -3252,6 +3257,26 @@
 </w:ftr>
 </file>
 
+<file path=word/footer2.xml><?xml version="1.0" encoding="utf-8"?>
+<w:ftr xmlns:m="http://schemas.openxmlformats.org/officeDocument/2006/math" xmlns:mc="http://schemas.openxmlformats.org/markup-compatibility/2006" xmlns:mo="http://schemas.microsoft.com/office/mac/office/2008/main" xmlns:mv="urn:schemas-microsoft-com:mac:vml" xmlns:o="urn:schemas-microsoft-com:office:office" xmlns:r="http://schemas.openxmlformats.org/officeDocument/2006/relationships" xmlns:v="urn:schemas-microsoft-com:vml" xmlns:w10="urn:schemas-microsoft-com:office:word" xmlns:w14="http://schemas.microsoft.com/office/word/2010/wordml" xmlns:w="http://schemas.openxmlformats.org/wordprocessingml/2006/main" xmlns:wne="http://schemas.microsoft.com/office/word/2006/wordml" xmlns:wp14="http://schemas.microsoft.com/office/word/2010/wordprocessingDrawing" xmlns:wp="http://schemas.openxmlformats.org/drawingml/2006/wordprocessingDrawing" xmlns:wpc="http://schemas.microsoft.com/office/word/2010/wordprocessingCanvas" xmlns:wpg="http://schemas.microsoft.com/office/word/2010/wordprocessingGroup" xmlns:wpi="http://schemas.microsoft.com/office/word/2010/wordprocessingInk" xmlns:wps="http://schemas.microsoft.com/office/word/2010/wordprocessingShape" mc:Ignorable="w14 wp14">
+  <w:p>
+    <w:pPr>
+      <w:pStyle w:val="Footer"/>
+    </w:pPr>
+  </w:p>
+</w:ftr>
+</file>
+
+<file path=word/footer3.xml><?xml version="1.0" encoding="utf-8"?>
+<w:ftr xmlns:m="http://schemas.openxmlformats.org/officeDocument/2006/math" xmlns:mc="http://schemas.openxmlformats.org/markup-compatibility/2006" xmlns:mo="http://schemas.microsoft.com/office/mac/office/2008/main" xmlns:mv="urn:schemas-microsoft-com:mac:vml" xmlns:o="urn:schemas-microsoft-com:office:office" xmlns:r="http://schemas.openxmlformats.org/officeDocument/2006/relationships" xmlns:v="urn:schemas-microsoft-com:vml" xmlns:w10="urn:schemas-microsoft-com:office:word" xmlns:w14="http://schemas.microsoft.com/office/word/2010/wordml" xmlns:w="http://schemas.openxmlformats.org/wordprocessingml/2006/main" xmlns:wne="http://schemas.microsoft.com/office/word/2006/wordml" xmlns:wp14="http://schemas.microsoft.com/office/word/2010/wordprocessingDrawing" xmlns:wp="http://schemas.openxmlformats.org/drawingml/2006/wordprocessingDrawing" xmlns:wpc="http://schemas.microsoft.com/office/word/2010/wordprocessingCanvas" xmlns:wpg="http://schemas.microsoft.com/office/word/2010/wordprocessingGroup" xmlns:wpi="http://schemas.microsoft.com/office/word/2010/wordprocessingInk" xmlns:wps="http://schemas.microsoft.com/office/word/2010/wordprocessingShape" mc:Ignorable="w14 wp14">
+  <w:p>
+    <w:pPr>
+      <w:pStyle w:val="Footer"/>
+    </w:pPr>
+  </w:p>
+</w:ftr>
+</file>
+
 <file path=word/footnotes.xml><?xml version="1.0" encoding="utf-8"?>
 <w:footnotes xmlns:wpc="http://schemas.microsoft.com/office/word/2010/wordprocessingCanvas" xmlns:cx="http://schemas.microsoft.com/office/drawing/2014/chartex" xmlns:mc="http://schemas.openxmlformats.org/markup-compatibility/2006" xmlns:o="urn:schemas-microsoft-com:office:office" xmlns:r="http://schemas.openxmlformats.org/officeDocument/2006/relationships" xmlns:m="http://schemas.openxmlformats.org/officeDocument/2006/math" xmlns:v="urn:schemas-microsoft-com:vml" xmlns:wp14="http://schemas.microsoft.com/office/word/2010/wordprocessingDrawing" xmlns:wp="http://schemas.openxmlformats.org/drawingml/2006/wordprocessingDrawing" xmlns:w10="urn:schemas-microsoft-com:office:word" xmlns:w="http://schemas.openxmlformats.org/wordprocessingml/2006/main" xmlns:w14="http://schemas.microsoft.com/office/word/2010/wordml" xmlns:w15="http://schemas.microsoft.com/office/word/2012/wordml" xmlns:w16se="http://schemas.microsoft.com/office/word/2015/wordml/symex" xmlns:wpg="http://schemas.microsoft.com/office/word/2010/wordprocessingGroup" xmlns:wpi="http://schemas.microsoft.com/office/word/2010/wordprocessingInk" xmlns:wne="http://schemas.microsoft.com/office/word/2006/wordml" xmlns:wps="http://schemas.microsoft.com/office/word/2010/wordprocessingShape" mc:Ignorable="w14 w15 w16se wp14">
   <w:footnote w:type="separator" w:id="-1">
@@ -3269,6 +3294,36 @@
     </w:p>
   </w:footnote>
 </w:footnotes>
+</file>
+
+<file path=word/header1.xml><?xml version="1.0" encoding="utf-8"?>
+<w:hdr xmlns:m="http://schemas.openxmlformats.org/officeDocument/2006/math" xmlns:mc="http://schemas.openxmlformats.org/markup-compatibility/2006" xmlns:mo="http://schemas.microsoft.com/office/mac/office/2008/main" xmlns:mv="urn:schemas-microsoft-com:mac:vml" xmlns:o="urn:schemas-microsoft-com:office:office" xmlns:r="http://schemas.openxmlformats.org/officeDocument/2006/relationships" xmlns:v="urn:schemas-microsoft-com:vml" xmlns:w10="urn:schemas-microsoft-com:office:word" xmlns:w14="http://schemas.microsoft.com/office/word/2010/wordml" xmlns:w="http://schemas.openxmlformats.org/wordprocessingml/2006/main" xmlns:wne="http://schemas.microsoft.com/office/word/2006/wordml" xmlns:wp14="http://schemas.microsoft.com/office/word/2010/wordprocessingDrawing" xmlns:wp="http://schemas.openxmlformats.org/drawingml/2006/wordprocessingDrawing" xmlns:wpc="http://schemas.microsoft.com/office/word/2010/wordprocessingCanvas" xmlns:wpg="http://schemas.microsoft.com/office/word/2010/wordprocessingGroup" xmlns:wpi="http://schemas.microsoft.com/office/word/2010/wordprocessingInk" xmlns:wps="http://schemas.microsoft.com/office/word/2010/wordprocessingShape" mc:Ignorable="w14 wp14">
+  <w:p>
+    <w:pPr>
+      <w:pStyle w:val="Header"/>
+    </w:pPr>
+  </w:p>
+</w:hdr>
+</file>
+
+<file path=word/header2.xml><?xml version="1.0" encoding="utf-8"?>
+<w:hdr xmlns:m="http://schemas.openxmlformats.org/officeDocument/2006/math" xmlns:mc="http://schemas.openxmlformats.org/markup-compatibility/2006" xmlns:mo="http://schemas.microsoft.com/office/mac/office/2008/main" xmlns:mv="urn:schemas-microsoft-com:mac:vml" xmlns:o="urn:schemas-microsoft-com:office:office" xmlns:r="http://schemas.openxmlformats.org/officeDocument/2006/relationships" xmlns:v="urn:schemas-microsoft-com:vml" xmlns:w10="urn:schemas-microsoft-com:office:word" xmlns:w14="http://schemas.microsoft.com/office/word/2010/wordml" xmlns:w="http://schemas.openxmlformats.org/wordprocessingml/2006/main" xmlns:wne="http://schemas.microsoft.com/office/word/2006/wordml" xmlns:wp14="http://schemas.microsoft.com/office/word/2010/wordprocessingDrawing" xmlns:wp="http://schemas.openxmlformats.org/drawingml/2006/wordprocessingDrawing" xmlns:wpc="http://schemas.microsoft.com/office/word/2010/wordprocessingCanvas" xmlns:wpg="http://schemas.microsoft.com/office/word/2010/wordprocessingGroup" xmlns:wpi="http://schemas.microsoft.com/office/word/2010/wordprocessingInk" xmlns:wps="http://schemas.microsoft.com/office/word/2010/wordprocessingShape" mc:Ignorable="w14 wp14">
+  <w:p>
+    <w:pPr>
+      <w:pStyle w:val="Header"/>
+    </w:pPr>
+  </w:p>
+</w:hdr>
+</file>
+
+<file path=word/header3.xml><?xml version="1.0" encoding="utf-8"?>
+<w:hdr xmlns:m="http://schemas.openxmlformats.org/officeDocument/2006/math" xmlns:mc="http://schemas.openxmlformats.org/markup-compatibility/2006" xmlns:mo="http://schemas.microsoft.com/office/mac/office/2008/main" xmlns:mv="urn:schemas-microsoft-com:mac:vml" xmlns:o="urn:schemas-microsoft-com:office:office" xmlns:r="http://schemas.openxmlformats.org/officeDocument/2006/relationships" xmlns:v="urn:schemas-microsoft-com:vml" xmlns:w10="urn:schemas-microsoft-com:office:word" xmlns:w14="http://schemas.microsoft.com/office/word/2010/wordml" xmlns:w="http://schemas.openxmlformats.org/wordprocessingml/2006/main" xmlns:wne="http://schemas.microsoft.com/office/word/2006/wordml" xmlns:wp14="http://schemas.microsoft.com/office/word/2010/wordprocessingDrawing" xmlns:wp="http://schemas.openxmlformats.org/drawingml/2006/wordprocessingDrawing" xmlns:wpc="http://schemas.microsoft.com/office/word/2010/wordprocessingCanvas" xmlns:wpg="http://schemas.microsoft.com/office/word/2010/wordprocessingGroup" xmlns:wpi="http://schemas.microsoft.com/office/word/2010/wordprocessingInk" xmlns:wps="http://schemas.microsoft.com/office/word/2010/wordprocessingShape" mc:Ignorable="w14 wp14">
+  <w:p>
+    <w:pPr>
+      <w:pStyle w:val="Header"/>
+    </w:pPr>
+  </w:p>
+</w:hdr>
 </file>
 
 <file path=word/styles.xml><?xml version="1.0" encoding="utf-8"?>

</xml_diff>

<commit_message>
Update document templates and mappings to support multiple travel destinations
- Modified the Cover Letter and Sponsor Letter templates to include a new placeholder for `{{destinations}}`, allowing for multiple travel destinations in visa applications.
- Updated `document_mapping.json` to add the `destinations` key for both cover and sponsor documents.
- Revised documentation in `MAPPING.md` and `REQUEST_BODY.md` to reflect the addition of the `destinations` key and its usage.
- Enhanced the variable enrichment logic to ensure fallback to `schengen_country` when `destinations` is not provided.
</commit_message>
<xml_diff>
--- a/Documents Generation/Cover_Letter.docx
+++ b/Documents Generation/Cover_Letter.docx
@@ -390,7 +390,7 @@
           <w:sz w:val="20"/>
           <w:szCs w:val="20"/>
         </w:rPr>
-        <w:t>schengen_country</w:t>
+        <w:t>destinations</w:t>
       </w:r>
       <w:proofErr w:type="spellEnd"/>
       <w:r>
@@ -1981,7 +1981,7 @@
           <w:sz w:val="20"/>
           <w:szCs w:val="20"/>
         </w:rPr>
-        <w:t>schengen_country</w:t>
+        <w:t>destinations</w:t>
       </w:r>
       <w:proofErr w:type="spellEnd"/>
       <w:r>

</xml_diff>